<commit_message>
feat: implementacion del agente
</commit_message>
<xml_diff>
--- a/doc/evidencia.docx
+++ b/doc/evidencia.docx
@@ -10,10 +10,10 @@
     <w:p>
       <w:r>
         <w:drawing>
-          <wp:inline distT="0" distB="0" distL="0" distR="0" wp14:anchorId="4FBD4B62" wp14:editId="17C63526">
-            <wp:extent cx="5400040" cy="3277235"/>
-            <wp:effectExtent l="0" t="0" r="0" b="0"/>
-            <wp:docPr id="1993348005" name="Imagen 1"/>
+          <wp:inline distT="0" distB="0" distL="0" distR="0" wp14:anchorId="0587E95D" wp14:editId="4DC30DF6">
+            <wp:extent cx="5400040" cy="2911475"/>
+            <wp:effectExtent l="0" t="0" r="0" b="3175"/>
+            <wp:docPr id="1953334228" name="Imagen 1"/>
             <wp:cNvGraphicFramePr>
               <a:graphicFrameLocks xmlns:a="http://schemas.openxmlformats.org/drawingml/2006/main" noChangeAspect="1"/>
             </wp:cNvGraphicFramePr>
@@ -21,7 +21,7 @@
               <a:graphicData uri="http://schemas.openxmlformats.org/drawingml/2006/picture">
                 <pic:pic xmlns:pic="http://schemas.openxmlformats.org/drawingml/2006/picture">
                   <pic:nvPicPr>
-                    <pic:cNvPr id="1993348005" name=""/>
+                    <pic:cNvPr id="1953334228" name=""/>
                     <pic:cNvPicPr/>
                   </pic:nvPicPr>
                   <pic:blipFill>
@@ -33,7 +33,7 @@
                   <pic:spPr>
                     <a:xfrm>
                       <a:off x="0" y="0"/>
-                      <a:ext cx="5400040" cy="3277235"/>
+                      <a:ext cx="5400040" cy="2911475"/>
                     </a:xfrm>
                     <a:prstGeom prst="rect">
                       <a:avLst/>
@@ -46,7 +46,420 @@
         </w:drawing>
       </w:r>
     </w:p>
-    <w:p/>
+    <w:p>
+      <w:r>
+        <w:t>Agente ChatBot saludando</w:t>
+      </w:r>
+    </w:p>
+    <w:p>
+      <w:r>
+        <w:drawing>
+          <wp:inline distT="0" distB="0" distL="0" distR="0" wp14:anchorId="2AD89692" wp14:editId="5AC3B6AB">
+            <wp:extent cx="5400040" cy="2892425"/>
+            <wp:effectExtent l="0" t="0" r="0" b="3175"/>
+            <wp:docPr id="1865225799" name="Imagen 1"/>
+            <wp:cNvGraphicFramePr>
+              <a:graphicFrameLocks xmlns:a="http://schemas.openxmlformats.org/drawingml/2006/main" noChangeAspect="1"/>
+            </wp:cNvGraphicFramePr>
+            <a:graphic xmlns:a="http://schemas.openxmlformats.org/drawingml/2006/main">
+              <a:graphicData uri="http://schemas.openxmlformats.org/drawingml/2006/picture">
+                <pic:pic xmlns:pic="http://schemas.openxmlformats.org/drawingml/2006/picture">
+                  <pic:nvPicPr>
+                    <pic:cNvPr id="1865225799" name=""/>
+                    <pic:cNvPicPr/>
+                  </pic:nvPicPr>
+                  <pic:blipFill>
+                    <a:blip r:embed="rId5"/>
+                    <a:stretch>
+                      <a:fillRect/>
+                    </a:stretch>
+                  </pic:blipFill>
+                  <pic:spPr>
+                    <a:xfrm>
+                      <a:off x="0" y="0"/>
+                      <a:ext cx="5400040" cy="2892425"/>
+                    </a:xfrm>
+                    <a:prstGeom prst="rect">
+                      <a:avLst/>
+                    </a:prstGeom>
+                  </pic:spPr>
+                </pic:pic>
+              </a:graphicData>
+            </a:graphic>
+          </wp:inline>
+        </w:drawing>
+      </w:r>
+    </w:p>
+    <w:p>
+      <w:r>
+        <w:br w:type="page"/>
+      </w:r>
+    </w:p>
+    <w:p>
+      <w:pPr>
+        <w:jc w:val="center"/>
+        <w:rPr>
+          <w:b/>
+          <w:bCs/>
+        </w:rPr>
+      </w:pPr>
+      <w:r>
+        <w:rPr>
+          <w:b/>
+          <w:bCs/>
+        </w:rPr>
+        <w:lastRenderedPageBreak/>
+        <w:t>Pregunta 1:</w:t>
+      </w:r>
+      <w:r>
+        <w:rPr>
+          <w:b/>
+          <w:bCs/>
+        </w:rPr>
+        <w:t xml:space="preserve"> </w:t>
+      </w:r>
+      <w:r>
+        <w:rPr>
+          <w:b/>
+          <w:bCs/>
+        </w:rPr>
+        <w:t>Que certificaciones son patrocinadas por la empresa</w:t>
+      </w:r>
+    </w:p>
+    <w:p>
+      <w:r>
+        <w:drawing>
+          <wp:inline distT="0" distB="0" distL="0" distR="0" wp14:anchorId="383A184B" wp14:editId="2CDA01B5">
+            <wp:extent cx="5400040" cy="2893060"/>
+            <wp:effectExtent l="0" t="0" r="0" b="2540"/>
+            <wp:docPr id="1501944690" name="Imagen 1"/>
+            <wp:cNvGraphicFramePr>
+              <a:graphicFrameLocks xmlns:a="http://schemas.openxmlformats.org/drawingml/2006/main" noChangeAspect="1"/>
+            </wp:cNvGraphicFramePr>
+            <a:graphic xmlns:a="http://schemas.openxmlformats.org/drawingml/2006/main">
+              <a:graphicData uri="http://schemas.openxmlformats.org/drawingml/2006/picture">
+                <pic:pic xmlns:pic="http://schemas.openxmlformats.org/drawingml/2006/picture">
+                  <pic:nvPicPr>
+                    <pic:cNvPr id="1501944690" name=""/>
+                    <pic:cNvPicPr/>
+                  </pic:nvPicPr>
+                  <pic:blipFill>
+                    <a:blip r:embed="rId6"/>
+                    <a:stretch>
+                      <a:fillRect/>
+                    </a:stretch>
+                  </pic:blipFill>
+                  <pic:spPr>
+                    <a:xfrm>
+                      <a:off x="0" y="0"/>
+                      <a:ext cx="5400040" cy="2893060"/>
+                    </a:xfrm>
+                    <a:prstGeom prst="rect">
+                      <a:avLst/>
+                    </a:prstGeom>
+                  </pic:spPr>
+                </pic:pic>
+              </a:graphicData>
+            </a:graphic>
+          </wp:inline>
+        </w:drawing>
+      </w:r>
+    </w:p>
+    <w:p>
+      <w:pPr>
+        <w:jc w:val="center"/>
+      </w:pPr>
+      <w:r>
+        <w:t xml:space="preserve">Pregunta </w:t>
+      </w:r>
+      <w:r>
+        <w:t>2</w:t>
+      </w:r>
+      <w:r>
+        <w:t xml:space="preserve">: </w:t>
+      </w:r>
+      <w:r>
+        <w:t xml:space="preserve">Que </w:t>
+      </w:r>
+      <w:r>
+        <w:t>patrones de diseño están usando en pegasus para el backend</w:t>
+      </w:r>
+    </w:p>
+    <w:p>
+      <w:pPr>
+        <w:jc w:val="center"/>
+      </w:pPr>
+      <w:r>
+        <w:drawing>
+          <wp:inline distT="0" distB="0" distL="0" distR="0" wp14:anchorId="74070D3C" wp14:editId="3FD714CE">
+            <wp:extent cx="5400040" cy="3054985"/>
+            <wp:effectExtent l="0" t="0" r="0" b="0"/>
+            <wp:docPr id="1749650692" name="Imagen 1"/>
+            <wp:cNvGraphicFramePr>
+              <a:graphicFrameLocks xmlns:a="http://schemas.openxmlformats.org/drawingml/2006/main" noChangeAspect="1"/>
+            </wp:cNvGraphicFramePr>
+            <a:graphic xmlns:a="http://schemas.openxmlformats.org/drawingml/2006/main">
+              <a:graphicData uri="http://schemas.openxmlformats.org/drawingml/2006/picture">
+                <pic:pic xmlns:pic="http://schemas.openxmlformats.org/drawingml/2006/picture">
+                  <pic:nvPicPr>
+                    <pic:cNvPr id="1749650692" name=""/>
+                    <pic:cNvPicPr/>
+                  </pic:nvPicPr>
+                  <pic:blipFill>
+                    <a:blip r:embed="rId7"/>
+                    <a:stretch>
+                      <a:fillRect/>
+                    </a:stretch>
+                  </pic:blipFill>
+                  <pic:spPr>
+                    <a:xfrm>
+                      <a:off x="0" y="0"/>
+                      <a:ext cx="5400040" cy="3054985"/>
+                    </a:xfrm>
+                    <a:prstGeom prst="rect">
+                      <a:avLst/>
+                    </a:prstGeom>
+                  </pic:spPr>
+                </pic:pic>
+              </a:graphicData>
+            </a:graphic>
+          </wp:inline>
+        </w:drawing>
+      </w:r>
+    </w:p>
+    <w:p>
+      <w:r>
+        <w:br w:type="page"/>
+      </w:r>
+    </w:p>
+    <w:p>
+      <w:pPr>
+        <w:jc w:val="center"/>
+      </w:pPr>
+      <w:r>
+        <w:lastRenderedPageBreak/>
+        <w:t xml:space="preserve">Pregunta 3: </w:t>
+      </w:r>
+      <w:r>
+        <w:t>Puedes decirme que Nomenclatura estan dando a los archivos</w:t>
+      </w:r>
+    </w:p>
+    <w:p>
+      <w:pPr>
+        <w:jc w:val="center"/>
+      </w:pPr>
+      <w:r>
+        <w:drawing>
+          <wp:inline distT="0" distB="0" distL="0" distR="0" wp14:anchorId="431CA8E3" wp14:editId="0B1F5B42">
+            <wp:extent cx="4815195" cy="3048000"/>
+            <wp:effectExtent l="0" t="0" r="5080" b="0"/>
+            <wp:docPr id="243067972" name="Imagen 1"/>
+            <wp:cNvGraphicFramePr>
+              <a:graphicFrameLocks xmlns:a="http://schemas.openxmlformats.org/drawingml/2006/main" noChangeAspect="1"/>
+            </wp:cNvGraphicFramePr>
+            <a:graphic xmlns:a="http://schemas.openxmlformats.org/drawingml/2006/main">
+              <a:graphicData uri="http://schemas.openxmlformats.org/drawingml/2006/picture">
+                <pic:pic xmlns:pic="http://schemas.openxmlformats.org/drawingml/2006/picture">
+                  <pic:nvPicPr>
+                    <pic:cNvPr id="243067972" name=""/>
+                    <pic:cNvPicPr/>
+                  </pic:nvPicPr>
+                  <pic:blipFill>
+                    <a:blip r:embed="rId8"/>
+                    <a:stretch>
+                      <a:fillRect/>
+                    </a:stretch>
+                  </pic:blipFill>
+                  <pic:spPr>
+                    <a:xfrm>
+                      <a:off x="0" y="0"/>
+                      <a:ext cx="4824286" cy="3053755"/>
+                    </a:xfrm>
+                    <a:prstGeom prst="rect">
+                      <a:avLst/>
+                    </a:prstGeom>
+                  </pic:spPr>
+                </pic:pic>
+              </a:graphicData>
+            </a:graphic>
+          </wp:inline>
+        </w:drawing>
+      </w:r>
+    </w:p>
+    <w:p>
+      <w:pPr>
+        <w:jc w:val="center"/>
+      </w:pPr>
+      <w:r>
+        <w:t xml:space="preserve">Pregunta </w:t>
+      </w:r>
+      <w:r>
+        <w:t>4</w:t>
+      </w:r>
+      <w:r>
+        <w:t xml:space="preserve">: </w:t>
+      </w:r>
+      <w:r>
+        <w:t>Cuales son los criterios de escalada de severidad?</w:t>
+      </w:r>
+    </w:p>
+    <w:p>
+      <w:pPr>
+        <w:jc w:val="center"/>
+      </w:pPr>
+      <w:r>
+        <w:drawing>
+          <wp:inline distT="0" distB="0" distL="0" distR="0" wp14:anchorId="78654A74" wp14:editId="2E1B29EF">
+            <wp:extent cx="5063401" cy="2288771"/>
+            <wp:effectExtent l="0" t="0" r="4445" b="0"/>
+            <wp:docPr id="1572977076" name="Imagen 1"/>
+            <wp:cNvGraphicFramePr>
+              <a:graphicFrameLocks xmlns:a="http://schemas.openxmlformats.org/drawingml/2006/main" noChangeAspect="1"/>
+            </wp:cNvGraphicFramePr>
+            <a:graphic xmlns:a="http://schemas.openxmlformats.org/drawingml/2006/main">
+              <a:graphicData uri="http://schemas.openxmlformats.org/drawingml/2006/picture">
+                <pic:pic xmlns:pic="http://schemas.openxmlformats.org/drawingml/2006/picture">
+                  <pic:nvPicPr>
+                    <pic:cNvPr id="1572977076" name=""/>
+                    <pic:cNvPicPr/>
+                  </pic:nvPicPr>
+                  <pic:blipFill>
+                    <a:blip r:embed="rId9"/>
+                    <a:stretch>
+                      <a:fillRect/>
+                    </a:stretch>
+                  </pic:blipFill>
+                  <pic:spPr>
+                    <a:xfrm>
+                      <a:off x="0" y="0"/>
+                      <a:ext cx="5071834" cy="2292583"/>
+                    </a:xfrm>
+                    <a:prstGeom prst="rect">
+                      <a:avLst/>
+                    </a:prstGeom>
+                  </pic:spPr>
+                </pic:pic>
+              </a:graphicData>
+            </a:graphic>
+          </wp:inline>
+        </w:drawing>
+      </w:r>
+    </w:p>
+    <w:p>
+      <w:pPr>
+        <w:jc w:val="center"/>
+      </w:pPr>
+      <w:r>
+        <w:t xml:space="preserve">Pregunta </w:t>
+      </w:r>
+      <w:r>
+        <w:t>5</w:t>
+      </w:r>
+      <w:r>
+        <w:t xml:space="preserve">: </w:t>
+      </w:r>
+      <w:r>
+        <w:t>Cual es la Política de Versionado ?</w:t>
+      </w:r>
+    </w:p>
+    <w:p>
+      <w:pPr>
+        <w:jc w:val="center"/>
+      </w:pPr>
+      <w:r>
+        <w:drawing>
+          <wp:inline distT="0" distB="0" distL="0" distR="0" wp14:anchorId="769FDCCE" wp14:editId="09C149BD">
+            <wp:extent cx="5174372" cy="2105891"/>
+            <wp:effectExtent l="0" t="0" r="7620" b="8890"/>
+            <wp:docPr id="160745322" name="Imagen 1"/>
+            <wp:cNvGraphicFramePr>
+              <a:graphicFrameLocks xmlns:a="http://schemas.openxmlformats.org/drawingml/2006/main" noChangeAspect="1"/>
+            </wp:cNvGraphicFramePr>
+            <a:graphic xmlns:a="http://schemas.openxmlformats.org/drawingml/2006/main">
+              <a:graphicData uri="http://schemas.openxmlformats.org/drawingml/2006/picture">
+                <pic:pic xmlns:pic="http://schemas.openxmlformats.org/drawingml/2006/picture">
+                  <pic:nvPicPr>
+                    <pic:cNvPr id="160745322" name=""/>
+                    <pic:cNvPicPr/>
+                  </pic:nvPicPr>
+                  <pic:blipFill>
+                    <a:blip r:embed="rId10"/>
+                    <a:stretch>
+                      <a:fillRect/>
+                    </a:stretch>
+                  </pic:blipFill>
+                  <pic:spPr>
+                    <a:xfrm>
+                      <a:off x="0" y="0"/>
+                      <a:ext cx="5180250" cy="2108283"/>
+                    </a:xfrm>
+                    <a:prstGeom prst="rect">
+                      <a:avLst/>
+                    </a:prstGeom>
+                  </pic:spPr>
+                </pic:pic>
+              </a:graphicData>
+            </a:graphic>
+          </wp:inline>
+        </w:drawing>
+      </w:r>
+    </w:p>
+    <w:p>
+      <w:r>
+        <w:br w:type="page"/>
+      </w:r>
+    </w:p>
+    <w:p>
+      <w:pPr>
+        <w:jc w:val="center"/>
+      </w:pPr>
+      <w:r>
+        <w:lastRenderedPageBreak/>
+        <w:t>6. Pregunta fuera de contexto</w:t>
+      </w:r>
+      <w:r>
+        <w:drawing>
+          <wp:inline distT="0" distB="0" distL="0" distR="0" wp14:anchorId="1D6706B2" wp14:editId="6BE91BF6">
+            <wp:extent cx="5400040" cy="1636395"/>
+            <wp:effectExtent l="0" t="0" r="0" b="1905"/>
+            <wp:docPr id="506068562" name="Imagen 1"/>
+            <wp:cNvGraphicFramePr>
+              <a:graphicFrameLocks xmlns:a="http://schemas.openxmlformats.org/drawingml/2006/main" noChangeAspect="1"/>
+            </wp:cNvGraphicFramePr>
+            <a:graphic xmlns:a="http://schemas.openxmlformats.org/drawingml/2006/main">
+              <a:graphicData uri="http://schemas.openxmlformats.org/drawingml/2006/picture">
+                <pic:pic xmlns:pic="http://schemas.openxmlformats.org/drawingml/2006/picture">
+                  <pic:nvPicPr>
+                    <pic:cNvPr id="506068562" name=""/>
+                    <pic:cNvPicPr/>
+                  </pic:nvPicPr>
+                  <pic:blipFill>
+                    <a:blip r:embed="rId11"/>
+                    <a:stretch>
+                      <a:fillRect/>
+                    </a:stretch>
+                  </pic:blipFill>
+                  <pic:spPr>
+                    <a:xfrm>
+                      <a:off x="0" y="0"/>
+                      <a:ext cx="5400040" cy="1636395"/>
+                    </a:xfrm>
+                    <a:prstGeom prst="rect">
+                      <a:avLst/>
+                    </a:prstGeom>
+                  </pic:spPr>
+                </pic:pic>
+              </a:graphicData>
+            </a:graphic>
+          </wp:inline>
+        </w:drawing>
+      </w:r>
+    </w:p>
+    <w:p>
+      <w:pPr>
+        <w:jc w:val="center"/>
+      </w:pPr>
+    </w:p>
     <w:sectPr>
       <w:pgSz w:w="11906" w:h="16838"/>
       <w:pgMar w:top="1417" w:right="1701" w:bottom="1417" w:left="1701" w:header="708" w:footer="708" w:gutter="0"/>
@@ -461,7 +874,6 @@
   <w:style w:type="character" w:default="1" w:styleId="Fuentedeprrafopredeter">
     <w:name w:val="Default Paragraph Font"/>
     <w:uiPriority w:val="1"/>
-    <w:semiHidden/>
     <w:unhideWhenUsed/>
   </w:style>
   <w:style w:type="table" w:default="1" w:styleId="Tablanormal">

</xml_diff>

<commit_message>
docs: actualizacion de evidencia
</commit_message>
<xml_diff>
--- a/doc/evidencia.docx
+++ b/doc/evidencia.docx
@@ -3,12 +3,18 @@
 <w:document xmlns:wpc="http://schemas.microsoft.com/office/word/2010/wordprocessingCanvas" xmlns:cx="http://schemas.microsoft.com/office/drawing/2014/chartex" xmlns:cx1="http://schemas.microsoft.com/office/drawing/2015/9/8/chartex" xmlns:cx2="http://schemas.microsoft.com/office/drawing/2015/10/21/chartex" xmlns:cx3="http://schemas.microsoft.com/office/drawing/2016/5/9/chartex" xmlns:cx4="http://schemas.microsoft.com/office/drawing/2016/5/10/chartex" xmlns:cx5="http://schemas.microsoft.com/office/drawing/2016/5/11/chartex" xmlns:cx6="http://schemas.microsoft.com/office/drawing/2016/5/12/chartex" xmlns:cx7="http://schemas.microsoft.com/office/drawing/2016/5/13/chartex" xmlns:cx8="http://schemas.microsoft.com/office/drawing/2016/5/14/chartex" xmlns:mc="http://schemas.openxmlformats.org/markup-compatibility/2006" xmlns:aink="http://schemas.microsoft.com/office/drawing/2016/ink" xmlns:am3d="http://schemas.microsoft.com/office/drawing/2017/model3d" xmlns:o="urn:schemas-microsoft-com:office:office" xmlns:oel="http://schemas.microsoft.com/office/2019/extlst" xmlns:r="http://schemas.openxmlformats.org/officeDocument/2006/relationships" xmlns:m="http://schemas.openxmlformats.org/officeDocument/2006/math" xmlns:v="urn:schemas-microsoft-com:vml" xmlns:wp14="http://schemas.microsoft.com/office/word/2010/wordprocessingDrawing" xmlns:wp="http://schemas.openxmlformats.org/drawingml/2006/wordprocessingDrawing" xmlns:w10="urn:schemas-microsoft-com:office:word" xmlns:w="http://schemas.openxmlformats.org/wordprocessingml/2006/main" xmlns:w14="http://schemas.microsoft.com/office/word/2010/wordml" xmlns:w15="http://schemas.microsoft.com/office/word/2012/wordml" xmlns:w16cex="http://schemas.microsoft.com/office/word/2018/wordml/cex" xmlns:w16cid="http://schemas.microsoft.com/office/word/2016/wordml/cid" xmlns:w16="http://schemas.microsoft.com/office/word/2018/wordml" xmlns:w16du="http://schemas.microsoft.com/office/word/2023/wordml/word16du" xmlns:w16sdtdh="http://schemas.microsoft.com/office/word/2020/wordml/sdtdatahash" xmlns:w16se="http://schemas.microsoft.com/office/word/2015/wordml/symex" xmlns:wpg="http://schemas.microsoft.com/office/word/2010/wordprocessingGroup" xmlns:wpi="http://schemas.microsoft.com/office/word/2010/wordprocessingInk" xmlns:wne="http://schemas.microsoft.com/office/word/2006/wordml" xmlns:wps="http://schemas.microsoft.com/office/word/2010/wordprocessingShape" mc:Ignorable="w14 w15 w16se w16cid w16 w16cex w16sdtdh w16du wp14">
   <w:body>
     <w:p>
+      <w:pPr>
+        <w:jc w:val="center"/>
+      </w:pPr>
       <w:r>
         <w:t>Evidencia de carga de base de conocimientos a la nube</w:t>
       </w:r>
     </w:p>
     <w:p>
       <w:r>
+        <w:rPr>
+          <w:noProof/>
+        </w:rPr>
         <w:drawing>
           <wp:inline distT="0" distB="0" distL="0" distR="0" wp14:anchorId="0587E95D" wp14:editId="4DC30DF6">
             <wp:extent cx="5400040" cy="2911475"/>
@@ -47,12 +53,26 @@
       </w:r>
     </w:p>
     <w:p>
-      <w:r>
-        <w:t>Agente ChatBot saludando</w:t>
-      </w:r>
-    </w:p>
-    <w:p>
-      <w:r>
+      <w:pPr>
+        <w:jc w:val="center"/>
+      </w:pPr>
+      <w:r>
+        <w:t xml:space="preserve">Agente </w:t>
+      </w:r>
+      <w:proofErr w:type="spellStart"/>
+      <w:r>
+        <w:t>ChatBot</w:t>
+      </w:r>
+      <w:proofErr w:type="spellEnd"/>
+      <w:r>
+        <w:t xml:space="preserve"> saludando</w:t>
+      </w:r>
+    </w:p>
+    <w:p>
+      <w:r>
+        <w:rPr>
+          <w:noProof/>
+        </w:rPr>
         <w:drawing>
           <wp:inline distT="0" distB="0" distL="0" distR="0" wp14:anchorId="2AD89692" wp14:editId="5AC3B6AB">
             <wp:extent cx="5400040" cy="2892425"/>
@@ -116,18 +136,14 @@
           <w:b/>
           <w:bCs/>
         </w:rPr>
-        <w:t xml:space="preserve"> </w:t>
-      </w:r>
+        <w:t xml:space="preserve"> Que certificaciones son patrocinadas por la empresa</w:t>
+      </w:r>
+    </w:p>
+    <w:p>
       <w:r>
         <w:rPr>
-          <w:b/>
-          <w:bCs/>
+          <w:noProof/>
         </w:rPr>
-        <w:t>Que certificaciones son patrocinadas por la empresa</w:t>
-      </w:r>
-    </w:p>
-    <w:p>
-      <w:r>
         <w:drawing>
           <wp:inline distT="0" distB="0" distL="0" distR="0" wp14:anchorId="383A184B" wp14:editId="2CDA01B5">
             <wp:extent cx="5400040" cy="2893060"/>
@@ -170,26 +186,36 @@
         <w:jc w:val="center"/>
       </w:pPr>
       <w:r>
-        <w:t xml:space="preserve">Pregunta </w:t>
-      </w:r>
-      <w:r>
-        <w:t>2</w:t>
-      </w:r>
-      <w:r>
-        <w:t xml:space="preserve">: </w:t>
+        <w:t xml:space="preserve">Pregunta 2: </w:t>
       </w:r>
       <w:r>
         <w:t xml:space="preserve">Que </w:t>
       </w:r>
       <w:r>
-        <w:t>patrones de diseño están usando en pegasus para el backend</w:t>
-      </w:r>
+        <w:t xml:space="preserve">patrones de diseño están usando en </w:t>
+      </w:r>
+      <w:proofErr w:type="spellStart"/>
+      <w:r>
+        <w:t>pegasus</w:t>
+      </w:r>
+      <w:proofErr w:type="spellEnd"/>
+      <w:r>
+        <w:t xml:space="preserve"> para el </w:t>
+      </w:r>
+      <w:proofErr w:type="spellStart"/>
+      <w:r>
+        <w:t>backend</w:t>
+      </w:r>
+      <w:proofErr w:type="spellEnd"/>
     </w:p>
     <w:p>
       <w:pPr>
         <w:jc w:val="center"/>
       </w:pPr>
       <w:r>
+        <w:rPr>
+          <w:noProof/>
+        </w:rPr>
         <w:drawing>
           <wp:inline distT="0" distB="0" distL="0" distR="0" wp14:anchorId="74070D3C" wp14:editId="3FD714CE">
             <wp:extent cx="5400040" cy="3054985"/>
@@ -241,7 +267,15 @@
         <w:t xml:space="preserve">Pregunta 3: </w:t>
       </w:r>
       <w:r>
-        <w:t>Puedes decirme que Nomenclatura estan dando a los archivos</w:t>
+        <w:t xml:space="preserve">Puedes decirme que Nomenclatura </w:t>
+      </w:r>
+      <w:proofErr w:type="spellStart"/>
+      <w:r>
+        <w:t>estan</w:t>
+      </w:r>
+      <w:proofErr w:type="spellEnd"/>
+      <w:r>
+        <w:t xml:space="preserve"> dando a los archivos</w:t>
       </w:r>
     </w:p>
     <w:p>
@@ -249,6 +283,9 @@
         <w:jc w:val="center"/>
       </w:pPr>
       <w:r>
+        <w:rPr>
+          <w:noProof/>
+        </w:rPr>
         <w:drawing>
           <wp:inline distT="0" distB="0" distL="0" distR="0" wp14:anchorId="431CA8E3" wp14:editId="0B1F5B42">
             <wp:extent cx="4815195" cy="3048000"/>
@@ -291,13 +328,7 @@
         <w:jc w:val="center"/>
       </w:pPr>
       <w:r>
-        <w:t xml:space="preserve">Pregunta </w:t>
-      </w:r>
-      <w:r>
-        <w:t>4</w:t>
-      </w:r>
-      <w:r>
-        <w:t xml:space="preserve">: </w:t>
+        <w:t xml:space="preserve">Pregunta 4: </w:t>
       </w:r>
       <w:r>
         <w:t>Cuales son los criterios de escalada de severidad?</w:t>
@@ -308,6 +339,9 @@
         <w:jc w:val="center"/>
       </w:pPr>
       <w:r>
+        <w:rPr>
+          <w:noProof/>
+        </w:rPr>
         <w:drawing>
           <wp:inline distT="0" distB="0" distL="0" distR="0" wp14:anchorId="78654A74" wp14:editId="2E1B29EF">
             <wp:extent cx="5063401" cy="2288771"/>
@@ -350,23 +384,25 @@
         <w:jc w:val="center"/>
       </w:pPr>
       <w:r>
-        <w:t xml:space="preserve">Pregunta </w:t>
-      </w:r>
-      <w:r>
-        <w:t>5</w:t>
-      </w:r>
-      <w:r>
-        <w:t xml:space="preserve">: </w:t>
-      </w:r>
-      <w:r>
-        <w:t>Cual es la Política de Versionado ?</w:t>
-      </w:r>
+        <w:t xml:space="preserve">Pregunta 5: </w:t>
+      </w:r>
+      <w:r>
+        <w:t xml:space="preserve">Cual es la Política de </w:t>
+      </w:r>
+      <w:proofErr w:type="gramStart"/>
+      <w:r>
+        <w:t>Versionado ?</w:t>
+      </w:r>
+      <w:proofErr w:type="gramEnd"/>
     </w:p>
     <w:p>
       <w:pPr>
         <w:jc w:val="center"/>
       </w:pPr>
       <w:r>
+        <w:rPr>
+          <w:noProof/>
+        </w:rPr>
         <w:drawing>
           <wp:inline distT="0" distB="0" distL="0" distR="0" wp14:anchorId="769FDCCE" wp14:editId="09C149BD">
             <wp:extent cx="5174372" cy="2105891"/>
@@ -418,6 +454,9 @@
         <w:t>6. Pregunta fuera de contexto</w:t>
       </w:r>
       <w:r>
+        <w:rPr>
+          <w:noProof/>
+        </w:rPr>
         <w:drawing>
           <wp:inline distT="0" distB="0" distL="0" distR="0" wp14:anchorId="1D6706B2" wp14:editId="6BE91BF6">
             <wp:extent cx="5400040" cy="1636395"/>
@@ -874,6 +913,7 @@
   <w:style w:type="character" w:default="1" w:styleId="Fuentedeprrafopredeter">
     <w:name w:val="Default Paragraph Font"/>
     <w:uiPriority w:val="1"/>
+    <w:semiHidden/>
     <w:unhideWhenUsed/>
   </w:style>
   <w:style w:type="table" w:default="1" w:styleId="Tablanormal">

</xml_diff>